<commit_message>
change the cover for uiuc
</commit_message>
<xml_diff>
--- a/docs/cover_page_sample.docx
+++ b/docs/cover_page_sample.docx
@@ -1,6 +1,6 @@
 
 <file path=word/document.xml><?xml version="1.0" encoding="utf-8"?>
-<w:document xmlns:wpc="http://schemas.microsoft.com/office/word/2010/wordprocessingCanvas" xmlns:cx="http://schemas.microsoft.com/office/drawing/2014/chartex" xmlns:cx1="http://schemas.microsoft.com/office/drawing/2015/9/8/chartex" xmlns:cx2="http://schemas.microsoft.com/office/drawing/2015/10/21/chartex" xmlns:cx3="http://schemas.microsoft.com/office/drawing/2016/5/9/chartex" xmlns:cx4="http://schemas.microsoft.com/office/drawing/2016/5/10/chartex" xmlns:cx5="http://schemas.microsoft.com/office/drawing/2016/5/11/chartex" xmlns:cx6="http://schemas.microsoft.com/office/drawing/2016/5/12/chartex" xmlns:cx7="http://schemas.microsoft.com/office/drawing/2016/5/13/chartex" xmlns:cx8="http://schemas.microsoft.com/office/drawing/2016/5/14/chartex" xmlns:mc="http://schemas.openxmlformats.org/markup-compatibility/2006" xmlns:aink="http://schemas.microsoft.com/office/drawing/2016/ink" xmlns:am3d="http://schemas.microsoft.com/office/drawing/2017/model3d" xmlns:o="urn:schemas-microsoft-com:office:office" xmlns:oel="http://schemas.microsoft.com/office/2019/extlst" xmlns:r="http://schemas.openxmlformats.org/officeDocument/2006/relationships" xmlns:m="http://schemas.openxmlformats.org/officeDocument/2006/math" xmlns:v="urn:schemas-microsoft-com:vml" xmlns:wp14="http://schemas.microsoft.com/office/word/2010/wordprocessingDrawing" xmlns:wp="http://schemas.openxmlformats.org/drawingml/2006/wordprocessingDrawing" xmlns:w10="urn:schemas-microsoft-com:office:word" xmlns:w="http://schemas.openxmlformats.org/wordprocessingml/2006/main" xmlns:w14="http://schemas.microsoft.com/office/word/2010/wordml" xmlns:w15="http://schemas.microsoft.com/office/word/2012/wordml" xmlns:w16cex="http://schemas.microsoft.com/office/word/2018/wordml/cex" xmlns:w16cid="http://schemas.microsoft.com/office/word/2016/wordml/cid" xmlns:w16="http://schemas.microsoft.com/office/word/2018/wordml" xmlns:w16du="http://schemas.microsoft.com/office/word/2023/wordml/word16du" xmlns:w16sdtdh="http://schemas.microsoft.com/office/word/2020/wordml/sdtdatahash" xmlns:w16sdtfl="http://schemas.microsoft.com/office/word/2024/wordml/sdtformatlock" xmlns:w16se="http://schemas.microsoft.com/office/word/2015/wordml/symex" xmlns:wpg="http://schemas.microsoft.com/office/word/2010/wordprocessingGroup" xmlns:wpi="http://schemas.microsoft.com/office/word/2010/wordprocessingInk" xmlns:wne="http://schemas.microsoft.com/office/word/2006/wordml" xmlns:wps="http://schemas.microsoft.com/office/word/2010/wordprocessingShape" mc:Ignorable="w14 w15 w16se w16cid w16 w16cex w16sdtdh w16sdtfl w16du wp14">
+<w:document xmlns:wpc="http://schemas.microsoft.com/office/word/2010/wordprocessingCanvas" xmlns:cx="http://schemas.microsoft.com/office/drawing/2014/chartex" xmlns:cx1="http://schemas.microsoft.com/office/drawing/2015/9/8/chartex" xmlns:cx2="http://schemas.microsoft.com/office/drawing/2015/10/21/chartex" xmlns:cx3="http://schemas.microsoft.com/office/drawing/2016/5/9/chartex" xmlns:cx4="http://schemas.microsoft.com/office/drawing/2016/5/10/chartex" xmlns:cx5="http://schemas.microsoft.com/office/drawing/2016/5/11/chartex" xmlns:cx6="http://schemas.microsoft.com/office/drawing/2016/5/12/chartex" xmlns:cx7="http://schemas.microsoft.com/office/drawing/2016/5/13/chartex" xmlns:cx8="http://schemas.microsoft.com/office/drawing/2016/5/14/chartex" xmlns:mc="http://schemas.openxmlformats.org/markup-compatibility/2006" xmlns:aink="http://schemas.microsoft.com/office/drawing/2016/ink" xmlns:am3d="http://schemas.microsoft.com/office/drawing/2017/model3d" xmlns:o="urn:schemas-microsoft-com:office:office" xmlns:oel="http://schemas.microsoft.com/office/2019/extlst" xmlns:r="http://schemas.openxmlformats.org/officeDocument/2006/relationships" xmlns:m="http://schemas.openxmlformats.org/officeDocument/2006/math" xmlns:v="urn:schemas-microsoft-com:vml" xmlns:wp14="http://schemas.microsoft.com/office/word/2010/wordprocessingDrawing" xmlns:wp="http://schemas.openxmlformats.org/drawingml/2006/wordprocessingDrawing" xmlns:w10="urn:schemas-microsoft-com:office:word" xmlns:w="http://schemas.openxmlformats.org/wordprocessingml/2006/main" xmlns:w14="http://schemas.microsoft.com/office/word/2010/wordml" xmlns:w15="http://schemas.microsoft.com/office/word/2012/wordml" xmlns:w16cex="http://schemas.microsoft.com/office/word/2018/wordml/cex" xmlns:w16cid="http://schemas.microsoft.com/office/word/2016/wordml/cid" xmlns:w16="http://schemas.microsoft.com/office/word/2018/wordml" xmlns:w16du="http://schemas.microsoft.com/office/word/2023/wordml/word16du" xmlns:w16sdtdh="http://schemas.microsoft.com/office/word/2020/wordml/sdtdatahash" xmlns:w16se="http://schemas.microsoft.com/office/word/2015/wordml/symex" xmlns:wpg="http://schemas.microsoft.com/office/word/2010/wordprocessingGroup" xmlns:wpi="http://schemas.microsoft.com/office/word/2010/wordprocessingInk" xmlns:wne="http://schemas.microsoft.com/office/word/2006/wordml" xmlns:wps="http://schemas.microsoft.com/office/word/2010/wordprocessingShape" mc:Ignorable="w14 w15 w16se w16cid w16 w16cex w16sdtdh w16du wp14">
   <w:body>
     <w:p>
       <w:pPr>
@@ -19,15 +19,15 @@
         <w:rPr>
           <w:rFonts w:ascii="Times New Roman" w:hAnsi="Times New Roman" w:cs="Times New Roman"/>
           <w:noProof/>
-          <w:sz w:val="24"/>
-          <w:szCs w:val="24"/>
+          <w:sz w:val="28"/>
+          <w:szCs w:val="28"/>
           <w:lang w:val="en-US"/>
         </w:rPr>
         <w:drawing>
-          <wp:inline distT="0" distB="0" distL="0" distR="0" wp14:anchorId="49BC7EC4" wp14:editId="5F5812D2">
-            <wp:extent cx="1381125" cy="1370965"/>
-            <wp:effectExtent l="0" t="0" r="9525" b="635"/>
-            <wp:docPr id="9" name="图片 9"/>
+          <wp:inline distT="0" distB="0" distL="0" distR="0" wp14:anchorId="1D429E6C" wp14:editId="1C9FC57F">
+            <wp:extent cx="4585547" cy="1539741"/>
+            <wp:effectExtent l="0" t="0" r="0" b="0"/>
+            <wp:docPr id="550627893" name="Picture 2" descr="A logo for a university&#10;&#10;Description automatically generated"/>
             <wp:cNvGraphicFramePr>
               <a:graphicFrameLocks xmlns:a="http://schemas.openxmlformats.org/drawingml/2006/main" noChangeAspect="1"/>
             </wp:cNvGraphicFramePr>
@@ -35,11 +35,11 @@
               <a:graphicData uri="http://schemas.openxmlformats.org/drawingml/2006/picture">
                 <pic:pic xmlns:pic="http://schemas.openxmlformats.org/drawingml/2006/picture">
                   <pic:nvPicPr>
-                    <pic:cNvPr id="9" name="白色校徽.jpg"/>
+                    <pic:cNvPr id="550627893" name="Picture 2" descr="A logo for a university&#10;&#10;Description automatically generated"/>
                     <pic:cNvPicPr/>
                   </pic:nvPicPr>
                   <pic:blipFill>
-                    <a:blip r:embed="rId6">
+                    <a:blip r:embed="rId6" cstate="print">
                       <a:extLst>
                         <a:ext uri="{28A0092B-C50C-407E-A947-70E740481C1C}">
                           <a14:useLocalDpi xmlns:a14="http://schemas.microsoft.com/office/drawing/2010/main" val="0"/>
@@ -53,7 +53,7 @@
                   <pic:spPr>
                     <a:xfrm>
                       <a:off x="0" y="0"/>
-                      <a:ext cx="1382982" cy="1372808"/>
+                      <a:ext cx="4648612" cy="1560917"/>
                     </a:xfrm>
                     <a:prstGeom prst="rect">
                       <a:avLst/>
@@ -68,7 +68,7 @@
     </w:p>
     <w:tbl>
       <w:tblPr>
-        <w:tblStyle w:val="a9"/>
+        <w:tblStyle w:val="TableGrid"/>
         <w:tblW w:w="8308" w:type="dxa"/>
         <w:tblBorders>
           <w:top w:val="none" w:sz="0" w:space="0" w:color="auto"/>
@@ -1869,7 +1869,7 @@
                     </wp:anchor>
                   </w:drawing>
                 </mc:Choice>
-                <mc:Fallback>
+                <mc:Fallback xmlns:w16sdtfl="http://schemas.microsoft.com/office/word/2024/wordml/sdtformatlock">
                   <w:pict>
                     <v:shapetype w14:anchorId="3B186DE9" id="_x0000_t202" coordsize="21600,21600" o:spt="202" path="m,l,21600r21600,l21600,xe">
                       <v:stroke joinstyle="miter"/>
@@ -2229,8 +2229,12 @@
       </w:pPr>
     </w:p>
     <w:sectPr>
-      <w:headerReference w:type="default" r:id="rId7"/>
-      <w:footerReference w:type="default" r:id="rId8"/>
+      <w:headerReference w:type="even" r:id="rId7"/>
+      <w:headerReference w:type="default" r:id="rId8"/>
+      <w:footerReference w:type="even" r:id="rId9"/>
+      <w:footerReference w:type="default" r:id="rId10"/>
+      <w:headerReference w:type="first" r:id="rId11"/>
+      <w:footerReference w:type="first" r:id="rId12"/>
       <w:pgSz w:w="11906" w:h="16838"/>
       <w:pgMar w:top="1440" w:right="1800" w:bottom="1440" w:left="1800" w:header="720" w:footer="720" w:gutter="0"/>
       <w:pgNumType w:start="1"/>
@@ -2242,7 +2246,7 @@
 </file>
 
 <file path=word/endnotes.xml><?xml version="1.0" encoding="utf-8"?>
-<w:endnotes xmlns:wpc="http://schemas.microsoft.com/office/word/2010/wordprocessingCanvas" xmlns:cx="http://schemas.microsoft.com/office/drawing/2014/chartex" xmlns:cx1="http://schemas.microsoft.com/office/drawing/2015/9/8/chartex" xmlns:cx2="http://schemas.microsoft.com/office/drawing/2015/10/21/chartex" xmlns:cx3="http://schemas.microsoft.com/office/drawing/2016/5/9/chartex" xmlns:cx4="http://schemas.microsoft.com/office/drawing/2016/5/10/chartex" xmlns:cx5="http://schemas.microsoft.com/office/drawing/2016/5/11/chartex" xmlns:cx6="http://schemas.microsoft.com/office/drawing/2016/5/12/chartex" xmlns:cx7="http://schemas.microsoft.com/office/drawing/2016/5/13/chartex" xmlns:cx8="http://schemas.microsoft.com/office/drawing/2016/5/14/chartex" xmlns:mc="http://schemas.openxmlformats.org/markup-compatibility/2006" xmlns:aink="http://schemas.microsoft.com/office/drawing/2016/ink" xmlns:am3d="http://schemas.microsoft.com/office/drawing/2017/model3d" xmlns:o="urn:schemas-microsoft-com:office:office" xmlns:oel="http://schemas.microsoft.com/office/2019/extlst" xmlns:r="http://schemas.openxmlformats.org/officeDocument/2006/relationships" xmlns:m="http://schemas.openxmlformats.org/officeDocument/2006/math" xmlns:v="urn:schemas-microsoft-com:vml" xmlns:wp14="http://schemas.microsoft.com/office/word/2010/wordprocessingDrawing" xmlns:wp="http://schemas.openxmlformats.org/drawingml/2006/wordprocessingDrawing" xmlns:w10="urn:schemas-microsoft-com:office:word" xmlns:w="http://schemas.openxmlformats.org/wordprocessingml/2006/main" xmlns:w14="http://schemas.microsoft.com/office/word/2010/wordml" xmlns:w15="http://schemas.microsoft.com/office/word/2012/wordml" xmlns:w16cex="http://schemas.microsoft.com/office/word/2018/wordml/cex" xmlns:w16cid="http://schemas.microsoft.com/office/word/2016/wordml/cid" xmlns:w16="http://schemas.microsoft.com/office/word/2018/wordml" xmlns:w16du="http://schemas.microsoft.com/office/word/2023/wordml/word16du" xmlns:w16sdtdh="http://schemas.microsoft.com/office/word/2020/wordml/sdtdatahash" xmlns:w16sdtfl="http://schemas.microsoft.com/office/word/2024/wordml/sdtformatlock" xmlns:w16se="http://schemas.microsoft.com/office/word/2015/wordml/symex" xmlns:wpg="http://schemas.microsoft.com/office/word/2010/wordprocessingGroup" xmlns:wpi="http://schemas.microsoft.com/office/word/2010/wordprocessingInk" xmlns:wne="http://schemas.microsoft.com/office/word/2006/wordml" xmlns:wps="http://schemas.microsoft.com/office/word/2010/wordprocessingShape" mc:Ignorable="w14 w15 w16se w16cid w16 w16cex w16sdtdh w16sdtfl w16du wp14">
+<w:endnotes xmlns:wpc="http://schemas.microsoft.com/office/word/2010/wordprocessingCanvas" xmlns:cx="http://schemas.microsoft.com/office/drawing/2014/chartex" xmlns:cx1="http://schemas.microsoft.com/office/drawing/2015/9/8/chartex" xmlns:cx2="http://schemas.microsoft.com/office/drawing/2015/10/21/chartex" xmlns:cx3="http://schemas.microsoft.com/office/drawing/2016/5/9/chartex" xmlns:cx4="http://schemas.microsoft.com/office/drawing/2016/5/10/chartex" xmlns:cx5="http://schemas.microsoft.com/office/drawing/2016/5/11/chartex" xmlns:cx6="http://schemas.microsoft.com/office/drawing/2016/5/12/chartex" xmlns:cx7="http://schemas.microsoft.com/office/drawing/2016/5/13/chartex" xmlns:cx8="http://schemas.microsoft.com/office/drawing/2016/5/14/chartex" xmlns:mc="http://schemas.openxmlformats.org/markup-compatibility/2006" xmlns:aink="http://schemas.microsoft.com/office/drawing/2016/ink" xmlns:am3d="http://schemas.microsoft.com/office/drawing/2017/model3d" xmlns:o="urn:schemas-microsoft-com:office:office" xmlns:oel="http://schemas.microsoft.com/office/2019/extlst" xmlns:r="http://schemas.openxmlformats.org/officeDocument/2006/relationships" xmlns:m="http://schemas.openxmlformats.org/officeDocument/2006/math" xmlns:v="urn:schemas-microsoft-com:vml" xmlns:wp14="http://schemas.microsoft.com/office/word/2010/wordprocessingDrawing" xmlns:wp="http://schemas.openxmlformats.org/drawingml/2006/wordprocessingDrawing" xmlns:w10="urn:schemas-microsoft-com:office:word" xmlns:w="http://schemas.openxmlformats.org/wordprocessingml/2006/main" xmlns:w14="http://schemas.microsoft.com/office/word/2010/wordml" xmlns:w15="http://schemas.microsoft.com/office/word/2012/wordml" xmlns:w16cex="http://schemas.microsoft.com/office/word/2018/wordml/cex" xmlns:w16cid="http://schemas.microsoft.com/office/word/2016/wordml/cid" xmlns:w16="http://schemas.microsoft.com/office/word/2018/wordml" xmlns:w16du="http://schemas.microsoft.com/office/word/2023/wordml/word16du" xmlns:w16sdtdh="http://schemas.microsoft.com/office/word/2020/wordml/sdtdatahash" xmlns:w16se="http://schemas.microsoft.com/office/word/2015/wordml/symex" xmlns:wpg="http://schemas.microsoft.com/office/word/2010/wordprocessingGroup" xmlns:wpi="http://schemas.microsoft.com/office/word/2010/wordprocessingInk" xmlns:wne="http://schemas.microsoft.com/office/word/2006/wordml" xmlns:wps="http://schemas.microsoft.com/office/word/2010/wordprocessingShape" mc:Ignorable="w14 w15 w16se w16cid w16 w16cex w16sdtdh w16du wp14">
   <w:endnote w:type="separator" w:id="-1">
     <w:p>
       <w:pPr>
@@ -2267,10 +2271,20 @@
 </file>
 
 <file path=word/footer1.xml><?xml version="1.0" encoding="utf-8"?>
-<w:ftr xmlns:wpc="http://schemas.microsoft.com/office/word/2010/wordprocessingCanvas" xmlns:cx="http://schemas.microsoft.com/office/drawing/2014/chartex" xmlns:cx1="http://schemas.microsoft.com/office/drawing/2015/9/8/chartex" xmlns:cx2="http://schemas.microsoft.com/office/drawing/2015/10/21/chartex" xmlns:cx3="http://schemas.microsoft.com/office/drawing/2016/5/9/chartex" xmlns:cx4="http://schemas.microsoft.com/office/drawing/2016/5/10/chartex" xmlns:cx5="http://schemas.microsoft.com/office/drawing/2016/5/11/chartex" xmlns:cx6="http://schemas.microsoft.com/office/drawing/2016/5/12/chartex" xmlns:cx7="http://schemas.microsoft.com/office/drawing/2016/5/13/chartex" xmlns:cx8="http://schemas.microsoft.com/office/drawing/2016/5/14/chartex" xmlns:mc="http://schemas.openxmlformats.org/markup-compatibility/2006" xmlns:aink="http://schemas.microsoft.com/office/drawing/2016/ink" xmlns:am3d="http://schemas.microsoft.com/office/drawing/2017/model3d" xmlns:o="urn:schemas-microsoft-com:office:office" xmlns:oel="http://schemas.microsoft.com/office/2019/extlst" xmlns:r="http://schemas.openxmlformats.org/officeDocument/2006/relationships" xmlns:m="http://schemas.openxmlformats.org/officeDocument/2006/math" xmlns:v="urn:schemas-microsoft-com:vml" xmlns:wp14="http://schemas.microsoft.com/office/word/2010/wordprocessingDrawing" xmlns:wp="http://schemas.openxmlformats.org/drawingml/2006/wordprocessingDrawing" xmlns:w10="urn:schemas-microsoft-com:office:word" xmlns:w="http://schemas.openxmlformats.org/wordprocessingml/2006/main" xmlns:w14="http://schemas.microsoft.com/office/word/2010/wordml" xmlns:w15="http://schemas.microsoft.com/office/word/2012/wordml" xmlns:w16cex="http://schemas.microsoft.com/office/word/2018/wordml/cex" xmlns:w16cid="http://schemas.microsoft.com/office/word/2016/wordml/cid" xmlns:w16="http://schemas.microsoft.com/office/word/2018/wordml" xmlns:w16du="http://schemas.microsoft.com/office/word/2023/wordml/word16du" xmlns:w16sdtdh="http://schemas.microsoft.com/office/word/2020/wordml/sdtdatahash" xmlns:w16sdtfl="http://schemas.microsoft.com/office/word/2024/wordml/sdtformatlock" xmlns:w16se="http://schemas.microsoft.com/office/word/2015/wordml/symex" xmlns:wpg="http://schemas.microsoft.com/office/word/2010/wordprocessingGroup" xmlns:wpi="http://schemas.microsoft.com/office/word/2010/wordprocessingInk" xmlns:wne="http://schemas.microsoft.com/office/word/2006/wordml" xmlns:wps="http://schemas.microsoft.com/office/word/2010/wordprocessingShape" mc:Ignorable="w14 w15 w16se w16cid w16 w16cex w16sdtdh w16sdtfl w16du wp14">
+<w:ftr xmlns:wpc="http://schemas.microsoft.com/office/word/2010/wordprocessingCanvas" xmlns:cx="http://schemas.microsoft.com/office/drawing/2014/chartex" xmlns:cx1="http://schemas.microsoft.com/office/drawing/2015/9/8/chartex" xmlns:cx2="http://schemas.microsoft.com/office/drawing/2015/10/21/chartex" xmlns:cx3="http://schemas.microsoft.com/office/drawing/2016/5/9/chartex" xmlns:cx4="http://schemas.microsoft.com/office/drawing/2016/5/10/chartex" xmlns:cx5="http://schemas.microsoft.com/office/drawing/2016/5/11/chartex" xmlns:cx6="http://schemas.microsoft.com/office/drawing/2016/5/12/chartex" xmlns:cx7="http://schemas.microsoft.com/office/drawing/2016/5/13/chartex" xmlns:cx8="http://schemas.microsoft.com/office/drawing/2016/5/14/chartex" xmlns:mc="http://schemas.openxmlformats.org/markup-compatibility/2006" xmlns:aink="http://schemas.microsoft.com/office/drawing/2016/ink" xmlns:am3d="http://schemas.microsoft.com/office/drawing/2017/model3d" xmlns:o="urn:schemas-microsoft-com:office:office" xmlns:oel="http://schemas.microsoft.com/office/2019/extlst" xmlns:r="http://schemas.openxmlformats.org/officeDocument/2006/relationships" xmlns:m="http://schemas.openxmlformats.org/officeDocument/2006/math" xmlns:v="urn:schemas-microsoft-com:vml" xmlns:wp14="http://schemas.microsoft.com/office/word/2010/wordprocessingDrawing" xmlns:wp="http://schemas.openxmlformats.org/drawingml/2006/wordprocessingDrawing" xmlns:w10="urn:schemas-microsoft-com:office:word" xmlns:w="http://schemas.openxmlformats.org/wordprocessingml/2006/main" xmlns:w14="http://schemas.microsoft.com/office/word/2010/wordml" xmlns:w15="http://schemas.microsoft.com/office/word/2012/wordml" xmlns:w16cex="http://schemas.microsoft.com/office/word/2018/wordml/cex" xmlns:w16cid="http://schemas.microsoft.com/office/word/2016/wordml/cid" xmlns:w16="http://schemas.microsoft.com/office/word/2018/wordml" xmlns:w16du="http://schemas.microsoft.com/office/word/2023/wordml/word16du" xmlns:w16sdtdh="http://schemas.microsoft.com/office/word/2020/wordml/sdtdatahash" xmlns:w16se="http://schemas.microsoft.com/office/word/2015/wordml/symex" xmlns:wpg="http://schemas.microsoft.com/office/word/2010/wordprocessingGroup" xmlns:wpi="http://schemas.microsoft.com/office/word/2010/wordprocessingInk" xmlns:wne="http://schemas.microsoft.com/office/word/2006/wordml" xmlns:wps="http://schemas.microsoft.com/office/word/2010/wordprocessingShape" mc:Ignorable="w14 w15 w16se w16cid w16 w16cex w16sdtdh w16du wp14">
   <w:p>
     <w:pPr>
-      <w:pStyle w:val="a5"/>
+      <w:pStyle w:val="Footer"/>
+    </w:pPr>
+  </w:p>
+</w:ftr>
+</file>
+
+<file path=word/footer2.xml><?xml version="1.0" encoding="utf-8"?>
+<w:ftr xmlns:wpc="http://schemas.microsoft.com/office/word/2010/wordprocessingCanvas" xmlns:cx="http://schemas.microsoft.com/office/drawing/2014/chartex" xmlns:cx1="http://schemas.microsoft.com/office/drawing/2015/9/8/chartex" xmlns:cx2="http://schemas.microsoft.com/office/drawing/2015/10/21/chartex" xmlns:cx3="http://schemas.microsoft.com/office/drawing/2016/5/9/chartex" xmlns:cx4="http://schemas.microsoft.com/office/drawing/2016/5/10/chartex" xmlns:cx5="http://schemas.microsoft.com/office/drawing/2016/5/11/chartex" xmlns:cx6="http://schemas.microsoft.com/office/drawing/2016/5/12/chartex" xmlns:cx7="http://schemas.microsoft.com/office/drawing/2016/5/13/chartex" xmlns:cx8="http://schemas.microsoft.com/office/drawing/2016/5/14/chartex" xmlns:mc="http://schemas.openxmlformats.org/markup-compatibility/2006" xmlns:aink="http://schemas.microsoft.com/office/drawing/2016/ink" xmlns:am3d="http://schemas.microsoft.com/office/drawing/2017/model3d" xmlns:o="urn:schemas-microsoft-com:office:office" xmlns:oel="http://schemas.microsoft.com/office/2019/extlst" xmlns:r="http://schemas.openxmlformats.org/officeDocument/2006/relationships" xmlns:m="http://schemas.openxmlformats.org/officeDocument/2006/math" xmlns:v="urn:schemas-microsoft-com:vml" xmlns:wp14="http://schemas.microsoft.com/office/word/2010/wordprocessingDrawing" xmlns:wp="http://schemas.openxmlformats.org/drawingml/2006/wordprocessingDrawing" xmlns:w10="urn:schemas-microsoft-com:office:word" xmlns:w="http://schemas.openxmlformats.org/wordprocessingml/2006/main" xmlns:w14="http://schemas.microsoft.com/office/word/2010/wordml" xmlns:w15="http://schemas.microsoft.com/office/word/2012/wordml" xmlns:w16cex="http://schemas.microsoft.com/office/word/2018/wordml/cex" xmlns:w16cid="http://schemas.microsoft.com/office/word/2016/wordml/cid" xmlns:w16="http://schemas.microsoft.com/office/word/2018/wordml" xmlns:w16du="http://schemas.microsoft.com/office/word/2023/wordml/word16du" xmlns:w16sdtdh="http://schemas.microsoft.com/office/word/2020/wordml/sdtdatahash" xmlns:w16se="http://schemas.microsoft.com/office/word/2015/wordml/symex" xmlns:wpg="http://schemas.microsoft.com/office/word/2010/wordprocessingGroup" xmlns:wpi="http://schemas.microsoft.com/office/word/2010/wordprocessingInk" xmlns:wne="http://schemas.microsoft.com/office/word/2006/wordml" xmlns:wps="http://schemas.microsoft.com/office/word/2010/wordprocessingShape" mc:Ignorable="w14 w15 w16se w16cid w16 w16cex w16sdtdh w16du wp14">
+  <w:p>
+    <w:pPr>
+      <w:pStyle w:val="Footer"/>
       <w:jc w:val="center"/>
       <w:rPr>
         <w:rFonts w:ascii="Times New Roman" w:hAnsi="Times New Roman" w:cs="Times New Roman"/>
@@ -2320,8 +2334,18 @@
 </w:ftr>
 </file>
 
+<file path=word/footer3.xml><?xml version="1.0" encoding="utf-8"?>
+<w:ftr xmlns:wpc="http://schemas.microsoft.com/office/word/2010/wordprocessingCanvas" xmlns:cx="http://schemas.microsoft.com/office/drawing/2014/chartex" xmlns:cx1="http://schemas.microsoft.com/office/drawing/2015/9/8/chartex" xmlns:cx2="http://schemas.microsoft.com/office/drawing/2015/10/21/chartex" xmlns:cx3="http://schemas.microsoft.com/office/drawing/2016/5/9/chartex" xmlns:cx4="http://schemas.microsoft.com/office/drawing/2016/5/10/chartex" xmlns:cx5="http://schemas.microsoft.com/office/drawing/2016/5/11/chartex" xmlns:cx6="http://schemas.microsoft.com/office/drawing/2016/5/12/chartex" xmlns:cx7="http://schemas.microsoft.com/office/drawing/2016/5/13/chartex" xmlns:cx8="http://schemas.microsoft.com/office/drawing/2016/5/14/chartex" xmlns:mc="http://schemas.openxmlformats.org/markup-compatibility/2006" xmlns:aink="http://schemas.microsoft.com/office/drawing/2016/ink" xmlns:am3d="http://schemas.microsoft.com/office/drawing/2017/model3d" xmlns:o="urn:schemas-microsoft-com:office:office" xmlns:oel="http://schemas.microsoft.com/office/2019/extlst" xmlns:r="http://schemas.openxmlformats.org/officeDocument/2006/relationships" xmlns:m="http://schemas.openxmlformats.org/officeDocument/2006/math" xmlns:v="urn:schemas-microsoft-com:vml" xmlns:wp14="http://schemas.microsoft.com/office/word/2010/wordprocessingDrawing" xmlns:wp="http://schemas.openxmlformats.org/drawingml/2006/wordprocessingDrawing" xmlns:w10="urn:schemas-microsoft-com:office:word" xmlns:w="http://schemas.openxmlformats.org/wordprocessingml/2006/main" xmlns:w14="http://schemas.microsoft.com/office/word/2010/wordml" xmlns:w15="http://schemas.microsoft.com/office/word/2012/wordml" xmlns:w16cex="http://schemas.microsoft.com/office/word/2018/wordml/cex" xmlns:w16cid="http://schemas.microsoft.com/office/word/2016/wordml/cid" xmlns:w16="http://schemas.microsoft.com/office/word/2018/wordml" xmlns:w16du="http://schemas.microsoft.com/office/word/2023/wordml/word16du" xmlns:w16sdtdh="http://schemas.microsoft.com/office/word/2020/wordml/sdtdatahash" xmlns:w16se="http://schemas.microsoft.com/office/word/2015/wordml/symex" xmlns:wpg="http://schemas.microsoft.com/office/word/2010/wordprocessingGroup" xmlns:wpi="http://schemas.microsoft.com/office/word/2010/wordprocessingInk" xmlns:wne="http://schemas.microsoft.com/office/word/2006/wordml" xmlns:wps="http://schemas.microsoft.com/office/word/2010/wordprocessingShape" mc:Ignorable="w14 w15 w16se w16cid w16 w16cex w16sdtdh w16du wp14">
+  <w:p>
+    <w:pPr>
+      <w:pStyle w:val="Footer"/>
+    </w:pPr>
+  </w:p>
+</w:ftr>
+</file>
+
 <file path=word/footnotes.xml><?xml version="1.0" encoding="utf-8"?>
-<w:footnotes xmlns:wpc="http://schemas.microsoft.com/office/word/2010/wordprocessingCanvas" xmlns:cx="http://schemas.microsoft.com/office/drawing/2014/chartex" xmlns:cx1="http://schemas.microsoft.com/office/drawing/2015/9/8/chartex" xmlns:cx2="http://schemas.microsoft.com/office/drawing/2015/10/21/chartex" xmlns:cx3="http://schemas.microsoft.com/office/drawing/2016/5/9/chartex" xmlns:cx4="http://schemas.microsoft.com/office/drawing/2016/5/10/chartex" xmlns:cx5="http://schemas.microsoft.com/office/drawing/2016/5/11/chartex" xmlns:cx6="http://schemas.microsoft.com/office/drawing/2016/5/12/chartex" xmlns:cx7="http://schemas.microsoft.com/office/drawing/2016/5/13/chartex" xmlns:cx8="http://schemas.microsoft.com/office/drawing/2016/5/14/chartex" xmlns:mc="http://schemas.openxmlformats.org/markup-compatibility/2006" xmlns:aink="http://schemas.microsoft.com/office/drawing/2016/ink" xmlns:am3d="http://schemas.microsoft.com/office/drawing/2017/model3d" xmlns:o="urn:schemas-microsoft-com:office:office" xmlns:oel="http://schemas.microsoft.com/office/2019/extlst" xmlns:r="http://schemas.openxmlformats.org/officeDocument/2006/relationships" xmlns:m="http://schemas.openxmlformats.org/officeDocument/2006/math" xmlns:v="urn:schemas-microsoft-com:vml" xmlns:wp14="http://schemas.microsoft.com/office/word/2010/wordprocessingDrawing" xmlns:wp="http://schemas.openxmlformats.org/drawingml/2006/wordprocessingDrawing" xmlns:w10="urn:schemas-microsoft-com:office:word" xmlns:w="http://schemas.openxmlformats.org/wordprocessingml/2006/main" xmlns:w14="http://schemas.microsoft.com/office/word/2010/wordml" xmlns:w15="http://schemas.microsoft.com/office/word/2012/wordml" xmlns:w16cex="http://schemas.microsoft.com/office/word/2018/wordml/cex" xmlns:w16cid="http://schemas.microsoft.com/office/word/2016/wordml/cid" xmlns:w16="http://schemas.microsoft.com/office/word/2018/wordml" xmlns:w16du="http://schemas.microsoft.com/office/word/2023/wordml/word16du" xmlns:w16sdtdh="http://schemas.microsoft.com/office/word/2020/wordml/sdtdatahash" xmlns:w16sdtfl="http://schemas.microsoft.com/office/word/2024/wordml/sdtformatlock" xmlns:w16se="http://schemas.microsoft.com/office/word/2015/wordml/symex" xmlns:wpg="http://schemas.microsoft.com/office/word/2010/wordprocessingGroup" xmlns:wpi="http://schemas.microsoft.com/office/word/2010/wordprocessingInk" xmlns:wne="http://schemas.microsoft.com/office/word/2006/wordml" xmlns:wps="http://schemas.microsoft.com/office/word/2010/wordprocessingShape" mc:Ignorable="w14 w15 w16se w16cid w16 w16cex w16sdtdh w16sdtfl w16du wp14">
+<w:footnotes xmlns:wpc="http://schemas.microsoft.com/office/word/2010/wordprocessingCanvas" xmlns:cx="http://schemas.microsoft.com/office/drawing/2014/chartex" xmlns:cx1="http://schemas.microsoft.com/office/drawing/2015/9/8/chartex" xmlns:cx2="http://schemas.microsoft.com/office/drawing/2015/10/21/chartex" xmlns:cx3="http://schemas.microsoft.com/office/drawing/2016/5/9/chartex" xmlns:cx4="http://schemas.microsoft.com/office/drawing/2016/5/10/chartex" xmlns:cx5="http://schemas.microsoft.com/office/drawing/2016/5/11/chartex" xmlns:cx6="http://schemas.microsoft.com/office/drawing/2016/5/12/chartex" xmlns:cx7="http://schemas.microsoft.com/office/drawing/2016/5/13/chartex" xmlns:cx8="http://schemas.microsoft.com/office/drawing/2016/5/14/chartex" xmlns:mc="http://schemas.openxmlformats.org/markup-compatibility/2006" xmlns:aink="http://schemas.microsoft.com/office/drawing/2016/ink" xmlns:am3d="http://schemas.microsoft.com/office/drawing/2017/model3d" xmlns:o="urn:schemas-microsoft-com:office:office" xmlns:oel="http://schemas.microsoft.com/office/2019/extlst" xmlns:r="http://schemas.openxmlformats.org/officeDocument/2006/relationships" xmlns:m="http://schemas.openxmlformats.org/officeDocument/2006/math" xmlns:v="urn:schemas-microsoft-com:vml" xmlns:wp14="http://schemas.microsoft.com/office/word/2010/wordprocessingDrawing" xmlns:wp="http://schemas.openxmlformats.org/drawingml/2006/wordprocessingDrawing" xmlns:w10="urn:schemas-microsoft-com:office:word" xmlns:w="http://schemas.openxmlformats.org/wordprocessingml/2006/main" xmlns:w14="http://schemas.microsoft.com/office/word/2010/wordml" xmlns:w15="http://schemas.microsoft.com/office/word/2012/wordml" xmlns:w16cex="http://schemas.microsoft.com/office/word/2018/wordml/cex" xmlns:w16cid="http://schemas.microsoft.com/office/word/2016/wordml/cid" xmlns:w16="http://schemas.microsoft.com/office/word/2018/wordml" xmlns:w16du="http://schemas.microsoft.com/office/word/2023/wordml/word16du" xmlns:w16sdtdh="http://schemas.microsoft.com/office/word/2020/wordml/sdtdatahash" xmlns:w16se="http://schemas.microsoft.com/office/word/2015/wordml/symex" xmlns:wpg="http://schemas.microsoft.com/office/word/2010/wordprocessingGroup" xmlns:wpi="http://schemas.microsoft.com/office/word/2010/wordprocessingInk" xmlns:wne="http://schemas.microsoft.com/office/word/2006/wordml" xmlns:wps="http://schemas.microsoft.com/office/word/2010/wordprocessingShape" mc:Ignorable="w14 w15 w16se w16cid w16 w16cex w16sdtdh w16du wp14">
   <w:footnote w:type="separator" w:id="-1">
     <w:p>
       <w:pPr>
@@ -2346,10 +2370,20 @@
 </file>
 
 <file path=word/header1.xml><?xml version="1.0" encoding="utf-8"?>
-<w:hdr xmlns:wpc="http://schemas.microsoft.com/office/word/2010/wordprocessingCanvas" xmlns:cx="http://schemas.microsoft.com/office/drawing/2014/chartex" xmlns:cx1="http://schemas.microsoft.com/office/drawing/2015/9/8/chartex" xmlns:cx2="http://schemas.microsoft.com/office/drawing/2015/10/21/chartex" xmlns:cx3="http://schemas.microsoft.com/office/drawing/2016/5/9/chartex" xmlns:cx4="http://schemas.microsoft.com/office/drawing/2016/5/10/chartex" xmlns:cx5="http://schemas.microsoft.com/office/drawing/2016/5/11/chartex" xmlns:cx6="http://schemas.microsoft.com/office/drawing/2016/5/12/chartex" xmlns:cx7="http://schemas.microsoft.com/office/drawing/2016/5/13/chartex" xmlns:cx8="http://schemas.microsoft.com/office/drawing/2016/5/14/chartex" xmlns:mc="http://schemas.openxmlformats.org/markup-compatibility/2006" xmlns:aink="http://schemas.microsoft.com/office/drawing/2016/ink" xmlns:am3d="http://schemas.microsoft.com/office/drawing/2017/model3d" xmlns:o="urn:schemas-microsoft-com:office:office" xmlns:oel="http://schemas.microsoft.com/office/2019/extlst" xmlns:r="http://schemas.openxmlformats.org/officeDocument/2006/relationships" xmlns:m="http://schemas.openxmlformats.org/officeDocument/2006/math" xmlns:v="urn:schemas-microsoft-com:vml" xmlns:wp14="http://schemas.microsoft.com/office/word/2010/wordprocessingDrawing" xmlns:wp="http://schemas.openxmlformats.org/drawingml/2006/wordprocessingDrawing" xmlns:w10="urn:schemas-microsoft-com:office:word" xmlns:w="http://schemas.openxmlformats.org/wordprocessingml/2006/main" xmlns:w14="http://schemas.microsoft.com/office/word/2010/wordml" xmlns:w15="http://schemas.microsoft.com/office/word/2012/wordml" xmlns:w16cex="http://schemas.microsoft.com/office/word/2018/wordml/cex" xmlns:w16cid="http://schemas.microsoft.com/office/word/2016/wordml/cid" xmlns:w16="http://schemas.microsoft.com/office/word/2018/wordml" xmlns:w16du="http://schemas.microsoft.com/office/word/2023/wordml/word16du" xmlns:w16sdtdh="http://schemas.microsoft.com/office/word/2020/wordml/sdtdatahash" xmlns:w16sdtfl="http://schemas.microsoft.com/office/word/2024/wordml/sdtformatlock" xmlns:w16se="http://schemas.microsoft.com/office/word/2015/wordml/symex" xmlns:wpg="http://schemas.microsoft.com/office/word/2010/wordprocessingGroup" xmlns:wpi="http://schemas.microsoft.com/office/word/2010/wordprocessingInk" xmlns:wne="http://schemas.microsoft.com/office/word/2006/wordml" xmlns:wps="http://schemas.microsoft.com/office/word/2010/wordprocessingShape" mc:Ignorable="w14 w15 w16se w16cid w16 w16cex w16sdtdh w16sdtfl w16du wp14">
+<w:hdr xmlns:wpc="http://schemas.microsoft.com/office/word/2010/wordprocessingCanvas" xmlns:cx="http://schemas.microsoft.com/office/drawing/2014/chartex" xmlns:cx1="http://schemas.microsoft.com/office/drawing/2015/9/8/chartex" xmlns:cx2="http://schemas.microsoft.com/office/drawing/2015/10/21/chartex" xmlns:cx3="http://schemas.microsoft.com/office/drawing/2016/5/9/chartex" xmlns:cx4="http://schemas.microsoft.com/office/drawing/2016/5/10/chartex" xmlns:cx5="http://schemas.microsoft.com/office/drawing/2016/5/11/chartex" xmlns:cx6="http://schemas.microsoft.com/office/drawing/2016/5/12/chartex" xmlns:cx7="http://schemas.microsoft.com/office/drawing/2016/5/13/chartex" xmlns:cx8="http://schemas.microsoft.com/office/drawing/2016/5/14/chartex" xmlns:mc="http://schemas.openxmlformats.org/markup-compatibility/2006" xmlns:aink="http://schemas.microsoft.com/office/drawing/2016/ink" xmlns:am3d="http://schemas.microsoft.com/office/drawing/2017/model3d" xmlns:o="urn:schemas-microsoft-com:office:office" xmlns:oel="http://schemas.microsoft.com/office/2019/extlst" xmlns:r="http://schemas.openxmlformats.org/officeDocument/2006/relationships" xmlns:m="http://schemas.openxmlformats.org/officeDocument/2006/math" xmlns:v="urn:schemas-microsoft-com:vml" xmlns:wp14="http://schemas.microsoft.com/office/word/2010/wordprocessingDrawing" xmlns:wp="http://schemas.openxmlformats.org/drawingml/2006/wordprocessingDrawing" xmlns:w10="urn:schemas-microsoft-com:office:word" xmlns:w="http://schemas.openxmlformats.org/wordprocessingml/2006/main" xmlns:w14="http://schemas.microsoft.com/office/word/2010/wordml" xmlns:w15="http://schemas.microsoft.com/office/word/2012/wordml" xmlns:w16cex="http://schemas.microsoft.com/office/word/2018/wordml/cex" xmlns:w16cid="http://schemas.microsoft.com/office/word/2016/wordml/cid" xmlns:w16="http://schemas.microsoft.com/office/word/2018/wordml" xmlns:w16du="http://schemas.microsoft.com/office/word/2023/wordml/word16du" xmlns:w16sdtdh="http://schemas.microsoft.com/office/word/2020/wordml/sdtdatahash" xmlns:w16se="http://schemas.microsoft.com/office/word/2015/wordml/symex" xmlns:wpg="http://schemas.microsoft.com/office/word/2010/wordprocessingGroup" xmlns:wpi="http://schemas.microsoft.com/office/word/2010/wordprocessingInk" xmlns:wne="http://schemas.microsoft.com/office/word/2006/wordml" xmlns:wps="http://schemas.microsoft.com/office/word/2010/wordprocessingShape" mc:Ignorable="w14 w15 w16se w16cid w16 w16cex w16sdtdh w16du wp14">
   <w:p>
     <w:pPr>
-      <w:pStyle w:val="a3"/>
+      <w:pStyle w:val="Header"/>
+    </w:pPr>
+  </w:p>
+</w:hdr>
+</file>
+
+<file path=word/header2.xml><?xml version="1.0" encoding="utf-8"?>
+<w:hdr xmlns:wpc="http://schemas.microsoft.com/office/word/2010/wordprocessingCanvas" xmlns:cx="http://schemas.microsoft.com/office/drawing/2014/chartex" xmlns:cx1="http://schemas.microsoft.com/office/drawing/2015/9/8/chartex" xmlns:cx2="http://schemas.microsoft.com/office/drawing/2015/10/21/chartex" xmlns:cx3="http://schemas.microsoft.com/office/drawing/2016/5/9/chartex" xmlns:cx4="http://schemas.microsoft.com/office/drawing/2016/5/10/chartex" xmlns:cx5="http://schemas.microsoft.com/office/drawing/2016/5/11/chartex" xmlns:cx6="http://schemas.microsoft.com/office/drawing/2016/5/12/chartex" xmlns:cx7="http://schemas.microsoft.com/office/drawing/2016/5/13/chartex" xmlns:cx8="http://schemas.microsoft.com/office/drawing/2016/5/14/chartex" xmlns:mc="http://schemas.openxmlformats.org/markup-compatibility/2006" xmlns:aink="http://schemas.microsoft.com/office/drawing/2016/ink" xmlns:am3d="http://schemas.microsoft.com/office/drawing/2017/model3d" xmlns:o="urn:schemas-microsoft-com:office:office" xmlns:oel="http://schemas.microsoft.com/office/2019/extlst" xmlns:r="http://schemas.openxmlformats.org/officeDocument/2006/relationships" xmlns:m="http://schemas.openxmlformats.org/officeDocument/2006/math" xmlns:v="urn:schemas-microsoft-com:vml" xmlns:wp14="http://schemas.microsoft.com/office/word/2010/wordprocessingDrawing" xmlns:wp="http://schemas.openxmlformats.org/drawingml/2006/wordprocessingDrawing" xmlns:w10="urn:schemas-microsoft-com:office:word" xmlns:w="http://schemas.openxmlformats.org/wordprocessingml/2006/main" xmlns:w14="http://schemas.microsoft.com/office/word/2010/wordml" xmlns:w15="http://schemas.microsoft.com/office/word/2012/wordml" xmlns:w16cex="http://schemas.microsoft.com/office/word/2018/wordml/cex" xmlns:w16cid="http://schemas.microsoft.com/office/word/2016/wordml/cid" xmlns:w16="http://schemas.microsoft.com/office/word/2018/wordml" xmlns:w16du="http://schemas.microsoft.com/office/word/2023/wordml/word16du" xmlns:w16sdtdh="http://schemas.microsoft.com/office/word/2020/wordml/sdtdatahash" xmlns:w16se="http://schemas.microsoft.com/office/word/2015/wordml/symex" xmlns:wpg="http://schemas.microsoft.com/office/word/2010/wordprocessingGroup" xmlns:wpi="http://schemas.microsoft.com/office/word/2010/wordprocessingInk" xmlns:wne="http://schemas.microsoft.com/office/word/2006/wordml" xmlns:wps="http://schemas.microsoft.com/office/word/2010/wordprocessingShape" mc:Ignorable="w14 w15 w16se w16cid w16 w16cex w16sdtdh w16du wp14">
+  <w:p>
+    <w:pPr>
+      <w:pStyle w:val="Header"/>
       <w:jc w:val="center"/>
       <w:rPr>
         <w:rFonts w:ascii="Times New Roman" w:hAnsi="Times New Roman" w:cs="Times New Roman"/>
@@ -2365,14 +2399,51 @@
         <w:sz w:val="24"/>
         <w:szCs w:val="24"/>
       </w:rPr>
-      <w:t>XIAMEN UNIVERSITY MALAYSIA</w:t>
+      <w:t xml:space="preserve">UNIVERSITY </w:t>
+    </w:r>
+    <w:r>
+      <w:rPr>
+        <w:rFonts w:ascii="Times New Roman" w:hAnsi="Times New Roman" w:cs="Times New Roman"/>
+        <w:noProof/>
+        <w:sz w:val="24"/>
+        <w:szCs w:val="24"/>
+      </w:rPr>
+      <w:t xml:space="preserve">OF ILLINOIS </w:t>
+    </w:r>
+    <w:r>
+      <w:rPr>
+        <w:rFonts w:ascii="Times New Roman" w:hAnsi="Times New Roman" w:cs="Times New Roman"/>
+        <w:noProof/>
+        <w:sz w:val="24"/>
+        <w:szCs w:val="24"/>
+      </w:rPr>
+      <w:t>U</w:t>
+    </w:r>
+    <w:r>
+      <w:rPr>
+        <w:rFonts w:ascii="Times New Roman" w:hAnsi="Times New Roman" w:cs="Times New Roman"/>
+        <w:noProof/>
+        <w:sz w:val="24"/>
+        <w:szCs w:val="24"/>
+      </w:rPr>
+      <w:t>RBANA-CHAMPAIGN</w:t>
     </w:r>
   </w:p>
 </w:hdr>
 </file>
 
+<file path=word/header3.xml><?xml version="1.0" encoding="utf-8"?>
+<w:hdr xmlns:wpc="http://schemas.microsoft.com/office/word/2010/wordprocessingCanvas" xmlns:cx="http://schemas.microsoft.com/office/drawing/2014/chartex" xmlns:cx1="http://schemas.microsoft.com/office/drawing/2015/9/8/chartex" xmlns:cx2="http://schemas.microsoft.com/office/drawing/2015/10/21/chartex" xmlns:cx3="http://schemas.microsoft.com/office/drawing/2016/5/9/chartex" xmlns:cx4="http://schemas.microsoft.com/office/drawing/2016/5/10/chartex" xmlns:cx5="http://schemas.microsoft.com/office/drawing/2016/5/11/chartex" xmlns:cx6="http://schemas.microsoft.com/office/drawing/2016/5/12/chartex" xmlns:cx7="http://schemas.microsoft.com/office/drawing/2016/5/13/chartex" xmlns:cx8="http://schemas.microsoft.com/office/drawing/2016/5/14/chartex" xmlns:mc="http://schemas.openxmlformats.org/markup-compatibility/2006" xmlns:aink="http://schemas.microsoft.com/office/drawing/2016/ink" xmlns:am3d="http://schemas.microsoft.com/office/drawing/2017/model3d" xmlns:o="urn:schemas-microsoft-com:office:office" xmlns:oel="http://schemas.microsoft.com/office/2019/extlst" xmlns:r="http://schemas.openxmlformats.org/officeDocument/2006/relationships" xmlns:m="http://schemas.openxmlformats.org/officeDocument/2006/math" xmlns:v="urn:schemas-microsoft-com:vml" xmlns:wp14="http://schemas.microsoft.com/office/word/2010/wordprocessingDrawing" xmlns:wp="http://schemas.openxmlformats.org/drawingml/2006/wordprocessingDrawing" xmlns:w10="urn:schemas-microsoft-com:office:word" xmlns:w="http://schemas.openxmlformats.org/wordprocessingml/2006/main" xmlns:w14="http://schemas.microsoft.com/office/word/2010/wordml" xmlns:w15="http://schemas.microsoft.com/office/word/2012/wordml" xmlns:w16cex="http://schemas.microsoft.com/office/word/2018/wordml/cex" xmlns:w16cid="http://schemas.microsoft.com/office/word/2016/wordml/cid" xmlns:w16="http://schemas.microsoft.com/office/word/2018/wordml" xmlns:w16du="http://schemas.microsoft.com/office/word/2023/wordml/word16du" xmlns:w16sdtdh="http://schemas.microsoft.com/office/word/2020/wordml/sdtdatahash" xmlns:w16se="http://schemas.microsoft.com/office/word/2015/wordml/symex" xmlns:wpg="http://schemas.microsoft.com/office/word/2010/wordprocessingGroup" xmlns:wpi="http://schemas.microsoft.com/office/word/2010/wordprocessingInk" xmlns:wne="http://schemas.microsoft.com/office/word/2006/wordml" xmlns:wps="http://schemas.microsoft.com/office/word/2010/wordprocessingShape" mc:Ignorable="w14 w15 w16se w16cid w16 w16cex w16sdtdh w16du wp14">
+  <w:p>
+    <w:pPr>
+      <w:pStyle w:val="Header"/>
+    </w:pPr>
+  </w:p>
+</w:hdr>
+</file>
+
 <file path=word/styles.xml><?xml version="1.0" encoding="utf-8"?>
-<w:styles xmlns:mc="http://schemas.openxmlformats.org/markup-compatibility/2006" xmlns:r="http://schemas.openxmlformats.org/officeDocument/2006/relationships" xmlns:w="http://schemas.openxmlformats.org/wordprocessingml/2006/main" xmlns:w14="http://schemas.microsoft.com/office/word/2010/wordml" xmlns:w15="http://schemas.microsoft.com/office/word/2012/wordml" xmlns:w16cex="http://schemas.microsoft.com/office/word/2018/wordml/cex" xmlns:w16cid="http://schemas.microsoft.com/office/word/2016/wordml/cid" xmlns:w16="http://schemas.microsoft.com/office/word/2018/wordml" xmlns:w16du="http://schemas.microsoft.com/office/word/2023/wordml/word16du" xmlns:w16sdtdh="http://schemas.microsoft.com/office/word/2020/wordml/sdtdatahash" xmlns:w16sdtfl="http://schemas.microsoft.com/office/word/2024/wordml/sdtformatlock" xmlns:w16se="http://schemas.microsoft.com/office/word/2015/wordml/symex" mc:Ignorable="w14 w15 w16se w16cid w16 w16cex w16sdtdh w16sdtfl w16du">
+<w:styles xmlns:mc="http://schemas.openxmlformats.org/markup-compatibility/2006" xmlns:r="http://schemas.openxmlformats.org/officeDocument/2006/relationships" xmlns:w="http://schemas.openxmlformats.org/wordprocessingml/2006/main" xmlns:w14="http://schemas.microsoft.com/office/word/2010/wordml" xmlns:w15="http://schemas.microsoft.com/office/word/2012/wordml" xmlns:w16cex="http://schemas.microsoft.com/office/word/2018/wordml/cex" xmlns:w16cid="http://schemas.microsoft.com/office/word/2016/wordml/cid" xmlns:w16="http://schemas.microsoft.com/office/word/2018/wordml" xmlns:w16du="http://schemas.microsoft.com/office/word/2023/wordml/word16du" xmlns:w16sdtdh="http://schemas.microsoft.com/office/word/2020/wordml/sdtdatahash" xmlns:w16se="http://schemas.microsoft.com/office/word/2015/wordml/symex" mc:Ignorable="w14 w15 w16se w16cid w16 w16cex w16sdtdh w16du">
   <w:docDefaults>
     <w:rPrDefault>
       <w:rPr>
@@ -2766,18 +2837,18 @@
     <w:lsdException w:name="Unresolved Mention" w:semiHidden="1" w:unhideWhenUsed="1"/>
     <w:lsdException w:name="Smart Link" w:semiHidden="1" w:unhideWhenUsed="1"/>
   </w:latentStyles>
-  <w:style w:type="paragraph" w:default="1" w:styleId="a">
+  <w:style w:type="paragraph" w:default="1" w:styleId="Normal">
     <w:name w:val="Normal"/>
     <w:qFormat/>
     <w:rsid w:val="00DB14A7"/>
   </w:style>
-  <w:style w:type="character" w:default="1" w:styleId="a0">
+  <w:style w:type="character" w:default="1" w:styleId="DefaultParagraphFont">
     <w:name w:val="Default Paragraph Font"/>
     <w:uiPriority w:val="1"/>
     <w:semiHidden/>
     <w:unhideWhenUsed/>
   </w:style>
-  <w:style w:type="table" w:default="1" w:styleId="a1">
+  <w:style w:type="table" w:default="1" w:styleId="TableNormal">
     <w:name w:val="Normal Table"/>
     <w:uiPriority w:val="99"/>
     <w:semiHidden/>
@@ -2792,16 +2863,16 @@
       </w:tblCellMar>
     </w:tblPr>
   </w:style>
-  <w:style w:type="numbering" w:default="1" w:styleId="a2">
+  <w:style w:type="numbering" w:default="1" w:styleId="NoList">
     <w:name w:val="No List"/>
     <w:uiPriority w:val="99"/>
     <w:semiHidden/>
     <w:unhideWhenUsed/>
   </w:style>
-  <w:style w:type="paragraph" w:styleId="a3">
+  <w:style w:type="paragraph" w:styleId="Header">
     <w:name w:val="header"/>
-    <w:basedOn w:val="a"/>
-    <w:link w:val="a4"/>
+    <w:basedOn w:val="Normal"/>
+    <w:link w:val="HeaderChar"/>
     <w:uiPriority w:val="99"/>
     <w:unhideWhenUsed/>
     <w:rsid w:val="00DB14A7"/>
@@ -2813,17 +2884,17 @@
       <w:spacing w:after="0" w:line="240" w:lineRule="auto"/>
     </w:pPr>
   </w:style>
-  <w:style w:type="character" w:customStyle="1" w:styleId="a4">
-    <w:name w:val="页眉 字符"/>
-    <w:basedOn w:val="a0"/>
-    <w:link w:val="a3"/>
+  <w:style w:type="character" w:customStyle="1" w:styleId="HeaderChar">
+    <w:name w:val="Header Char"/>
+    <w:basedOn w:val="DefaultParagraphFont"/>
+    <w:link w:val="Header"/>
     <w:uiPriority w:val="99"/>
     <w:rsid w:val="00DB14A7"/>
   </w:style>
-  <w:style w:type="paragraph" w:styleId="a5">
+  <w:style w:type="paragraph" w:styleId="Footer">
     <w:name w:val="footer"/>
-    <w:basedOn w:val="a"/>
-    <w:link w:val="a6"/>
+    <w:basedOn w:val="Normal"/>
+    <w:link w:val="FooterChar"/>
     <w:uiPriority w:val="99"/>
     <w:unhideWhenUsed/>
     <w:rsid w:val="00DB14A7"/>
@@ -2835,17 +2906,17 @@
       <w:spacing w:after="0" w:line="240" w:lineRule="auto"/>
     </w:pPr>
   </w:style>
-  <w:style w:type="character" w:customStyle="1" w:styleId="a6">
-    <w:name w:val="页脚 字符"/>
-    <w:basedOn w:val="a0"/>
-    <w:link w:val="a5"/>
+  <w:style w:type="character" w:customStyle="1" w:styleId="FooterChar">
+    <w:name w:val="Footer Char"/>
+    <w:basedOn w:val="DefaultParagraphFont"/>
+    <w:link w:val="Footer"/>
     <w:uiPriority w:val="99"/>
     <w:rsid w:val="00DB14A7"/>
   </w:style>
-  <w:style w:type="paragraph" w:styleId="a7">
+  <w:style w:type="paragraph" w:styleId="BalloonText">
     <w:name w:val="Balloon Text"/>
-    <w:basedOn w:val="a"/>
-    <w:link w:val="a8"/>
+    <w:basedOn w:val="Normal"/>
+    <w:link w:val="BalloonTextChar"/>
     <w:uiPriority w:val="99"/>
     <w:semiHidden/>
     <w:unhideWhenUsed/>
@@ -2859,10 +2930,10 @@
       <w:szCs w:val="16"/>
     </w:rPr>
   </w:style>
-  <w:style w:type="character" w:customStyle="1" w:styleId="a8">
-    <w:name w:val="批注框文本 字符"/>
-    <w:basedOn w:val="a0"/>
-    <w:link w:val="a7"/>
+  <w:style w:type="character" w:customStyle="1" w:styleId="BalloonTextChar">
+    <w:name w:val="Balloon Text Char"/>
+    <w:basedOn w:val="DefaultParagraphFont"/>
+    <w:link w:val="BalloonText"/>
     <w:uiPriority w:val="99"/>
     <w:semiHidden/>
     <w:rsid w:val="00DB14A7"/>
@@ -2872,9 +2943,9 @@
       <w:szCs w:val="16"/>
     </w:rPr>
   </w:style>
-  <w:style w:type="table" w:styleId="a9">
+  <w:style w:type="table" w:styleId="TableGrid">
     <w:name w:val="Table Grid"/>
-    <w:basedOn w:val="a1"/>
+    <w:basedOn w:val="TableNormal"/>
     <w:uiPriority w:val="39"/>
     <w:rsid w:val="009D4032"/>
     <w:pPr>
@@ -2891,9 +2962,9 @@
       </w:tblBorders>
     </w:tblPr>
   </w:style>
-  <w:style w:type="paragraph" w:styleId="aa">
+  <w:style w:type="paragraph" w:styleId="NormalWeb">
     <w:name w:val="Normal (Web)"/>
-    <w:basedOn w:val="a"/>
+    <w:basedOn w:val="Normal"/>
     <w:uiPriority w:val="99"/>
     <w:unhideWhenUsed/>
     <w:rsid w:val="00775B47"/>

</xml_diff>